<commit_message>
refactor(a03,a05): replace Whisper speed test with homophones; drop A05 AI Studio question
A03 Q04 now tests homophone disambiguation, which depends on context
rather than audio, instead of speaking pace. The phone fallback is
replaced with whisperweb.app.

A05 drops the Google AI Studio question; the remaining questions are
renumbered.
</commit_message>
<xml_diff>
--- a/assignments/03-assignment.docx
+++ b/assignments/03-assignment.docx
@@ -26,7 +26,7 @@
         <w:t xml:space="preserve">Emory University</w:t>
       </w:r>
     </w:p>
-    <w:bookmarkStart w:id="19" w:name="instructions"/>
+    <w:bookmarkStart w:id="20" w:name="instructions"/>
     <w:p>
       <w:pPr>
         <w:pStyle w:val="Heading2"/>
@@ -977,13 +977,13 @@
       </w:r>
     </w:p>
     <w:bookmarkEnd w:id="13"/>
-    <w:bookmarkStart w:id="15" w:name="question-4-does-it-understand-your-voice"/>
+    <w:bookmarkStart w:id="16" w:name="question-4-same-sound-different-word"/>
     <w:p>
       <w:pPr>
         <w:pStyle w:val="Heading3"/>
       </w:pPr>
       <w:r>
-        <w:t xml:space="preserve">Question 4: Does it understand your voice?</w:t>
+        <w:t xml:space="preserve">Question 4: Same sound, different word</w:t>
       </w:r>
     </w:p>
     <w:p>
@@ -1017,7 +1017,24 @@
         </w:r>
       </w:hyperlink>
       <w:r>
-        <w:t xml:space="preserve">. If the page is down, record the sentences as voice memos on your phone instead, upload each file to ChatGPT or Gemini, and ask for an exact transcript</w:t>
+        <w:t xml:space="preserve">. If the page is down, use</w:t>
+      </w:r>
+      <w:r>
+        <w:t xml:space="preserve"> </w:t>
+      </w:r>
+      <w:hyperlink r:id="rId15">
+        <w:r>
+          <w:rPr>
+            <w:rStyle w:val="Hyperlink"/>
+          </w:rPr>
+          <w:t xml:space="preserve">whisperweb.app</w:t>
+        </w:r>
+      </w:hyperlink>
+      <w:r>
+        <w:t xml:space="preserve"> </w:t>
+      </w:r>
+      <w:r>
+        <w:t xml:space="preserve">instead</w:t>
       </w:r>
     </w:p>
     <w:p>
@@ -1029,7 +1046,7 @@
         </w:numPr>
       </w:pPr>
       <w:r>
-        <w:t xml:space="preserve">Record yourself reading this sentence at a normal pace:</w:t>
+        <w:t xml:space="preserve">Record yourself reading this at a normal pace:</w:t>
       </w:r>
       <w:r>
         <w:t xml:space="preserve"> </w:t>
@@ -1039,7 +1056,7 @@
           <w:i/>
           <w:iCs/>
         </w:rPr>
-        <w:t xml:space="preserve">“The doctor asked whether the patient had taken the medication yesterday.”</w:t>
+        <w:t xml:space="preserve">“I knew the new knight rode past the night rain. Their heir wore a bare bear.”</w:t>
       </w:r>
     </w:p>
     <w:p>
@@ -1051,19 +1068,7 @@
         </w:numPr>
       </w:pPr>
       <w:r>
-        <w:t xml:space="preserve">Record the same sentence again, this time speaking quickly</w:t>
-      </w:r>
-    </w:p>
-    <w:p>
-      <w:pPr>
-        <w:pStyle w:val="Compact"/>
-        <w:numPr>
-          <w:ilvl w:val="0"/>
-          <w:numId w:val="1007"/>
-        </w:numPr>
-      </w:pPr>
-      <w:r>
-        <w:t xml:space="preserve">Paste both transcripts exactly as they came out</w:t>
+        <w:t xml:space="preserve">Paste the transcript exactly as it came out</w:t>
       </w:r>
     </w:p>
     <w:p>
@@ -1087,7 +1092,7 @@
         </w:numPr>
       </w:pPr>
       <w:r>
-        <w:t xml:space="preserve">What changed between the two transcripts? Quote the exact words</w:t>
+        <w:t xml:space="preserve">Which homophones came out right and which came out wrong? Quote the exact words</w:t>
       </w:r>
     </w:p>
     <w:p>
@@ -1099,7 +1104,40 @@
         </w:numPr>
       </w:pPr>
       <w:r>
-        <w:t xml:space="preserve">The audio contains no punctuation. So who decided where the full stops and commas go?</w:t>
+        <w:t xml:space="preserve">The audio alone cannot tell</w:t>
+      </w:r>
+      <w:r>
+        <w:t xml:space="preserve"> </w:t>
+      </w:r>
+      <w:r>
+        <w:t xml:space="preserve">“knight”</w:t>
+      </w:r>
+      <w:r>
+        <w:t xml:space="preserve"> </w:t>
+      </w:r>
+      <w:r>
+        <w:t xml:space="preserve">from</w:t>
+      </w:r>
+      <w:r>
+        <w:t xml:space="preserve"> </w:t>
+      </w:r>
+      <w:r>
+        <w:t xml:space="preserve">“night”</w:t>
+      </w:r>
+      <w:r>
+        <w:t xml:space="preserve">. What did the model use to decide?</w:t>
+      </w:r>
+    </w:p>
+    <w:p>
+      <w:pPr>
+        <w:pStyle w:val="Compact"/>
+        <w:numPr>
+          <w:ilvl w:val="0"/>
+          <w:numId w:val="1008"/>
+        </w:numPr>
+      </w:pPr>
+      <w:r>
+        <w:t xml:space="preserve">Where it failed, what would a human listener have done differently?</w:t>
       </w:r>
     </w:p>
     <w:p>
@@ -1164,8 +1202,8 @@
         </w:pict>
       </w:r>
     </w:p>
-    <w:bookmarkEnd w:id="15"/>
-    <w:bookmarkStart w:id="17" w:name="question-5-train-your-own-classifier"/>
+    <w:bookmarkEnd w:id="16"/>
+    <w:bookmarkStart w:id="18" w:name="question-5-train-your-own-classifier"/>
     <w:p>
       <w:pPr>
         <w:pStyle w:val="Heading3"/>
@@ -1188,7 +1226,7 @@
       <w:r>
         <w:t xml:space="preserve"> </w:t>
       </w:r>
-      <w:hyperlink r:id="rId16">
+      <w:hyperlink r:id="rId17">
         <w:r>
           <w:rPr>
             <w:rStyle w:val="Hyperlink"/>
@@ -1424,8 +1462,8 @@
         </w:pict>
       </w:r>
     </w:p>
-    <w:bookmarkEnd w:id="17"/>
-    <w:bookmarkStart w:id="18" w:name="bonus-question-where-do-we-draw-the-line"/>
+    <w:bookmarkEnd w:id="18"/>
+    <w:bookmarkStart w:id="19" w:name="bonus-question-where-do-we-draw-the-line"/>
     <w:p>
       <w:pPr>
         <w:pStyle w:val="Heading3"/>
@@ -1585,8 +1623,8 @@
         <w:br/>
       </w:r>
     </w:p>
-    <w:bookmarkEnd w:id="18"/>
     <w:bookmarkEnd w:id="19"/>
+    <w:bookmarkEnd w:id="20"/>
     <w:sectPr>
       <w:footnotePr>
         <w:numRestart w:val="eachSect"/>

</xml_diff>